<commit_message>
wes on the deck
</commit_message>
<xml_diff>
--- a/Content/Arrangement/0.5 TheHuntersMoon.docx
+++ b/Content/Arrangement/0.5 TheHuntersMoon.docx
@@ -4,60 +4,606 @@
   <w:body>
     <w:p>
       <w:r>
-        <w:t xml:space="preserve">When Horace P. Hooper died he left behind a wife, who it turned out, actually </w:t>
-      </w:r>
-      <w:r>
-        <w:t>had loved</w:t>
-      </w:r>
-      <w:r>
-        <w:t xml:space="preserve"> him. He left his </w:t>
-      </w:r>
-      <w:r>
-        <w:t>distrust of his children in a series of irrevocable trusts. He left his dreams in a *-acre orchard of hazelnut trees</w:t>
-      </w:r>
-      <w:r>
-        <w:t xml:space="preserve"> he planted on a hillside that overlooked his home.</w:t>
-      </w:r>
-    </w:p>
-    <w:p>
-      <w:r>
-        <w:t>His children immediately set about revoking the irrevocable trusts</w:t>
-      </w:r>
-      <w:r>
-        <w:t xml:space="preserve"> and assuaged their grief with spending sprees.</w:t>
+        <w:t>The bulk of Horace P. Hooper’s estate went to Mosey, although he left a portion</w:t>
+      </w:r>
+      <w:r>
+        <w:t xml:space="preserve"> to irrevocable trusts he set up for each of his children.</w:t>
+      </w:r>
+      <w:r>
+        <w:t xml:space="preserve"> The siblings found that these irrevocable trusts were not so irrevocable as the </w:t>
+      </w:r>
+      <w:r>
+        <w:t>term</w:t>
+      </w:r>
+      <w:r>
+        <w:t xml:space="preserve"> implied, and </w:t>
+      </w:r>
+      <w:r>
+        <w:t>they</w:t>
+      </w:r>
+      <w:r>
+        <w:t xml:space="preserve"> hired attorney’s </w:t>
+      </w:r>
+      <w:r>
+        <w:t xml:space="preserve">to </w:t>
+      </w:r>
+      <w:r>
+        <w:t>revok</w:t>
+      </w:r>
+      <w:r>
+        <w:t>e</w:t>
+      </w:r>
+      <w:r>
+        <w:t xml:space="preserve"> them.</w:t>
       </w:r>
       <w:r>
         <w:t xml:space="preserve"> </w:t>
       </w:r>
-    </w:p>
-    <w:p>
-      <w:r>
-        <w:t xml:space="preserve">That following fall, Blind Marnie </w:t>
-      </w:r>
-    </w:p>
-    <w:p>
-      <w:r>
-        <w:t>Blind Marnie, alone among the Hooper siblings, made a nice livelihood for herself. She was respected among the witch communities as an advanced practitioner. She walked the woods with her pig, Ferdinand, and foraged among the growing things for herbs and lichens and such that she sold or fasioned into charms and potions that were sought after in the witch community. She had a reputation as a .</w:t>
-      </w:r>
-    </w:p>
-    <w:p>
-      <w:r>
-        <w:t>The fall following her father’s death she addressed the family and told them she was .</w:t>
-      </w:r>
-    </w:p>
-    <w:p>
-      <w:r>
-        <w:t>“October is the month of the Hunter’s Moon,” she said. “The Hunter’s Moon has great power and I will go into the orchard alone to practice my art and gather components for spells and .</w:t>
-      </w:r>
-    </w:p>
-    <w:p>
-      <w:r>
-        <w:t>Buford * at this.</w:t>
-      </w:r>
-    </w:p>
-    <w:p>
-      <w:r>
-        <w:t>“I’ll go anywhere on this farm I want whenever I want,” said Buford.</w:t>
+      <w:r>
+        <w:t>They quickly ran out of money</w:t>
+      </w:r>
+      <w:r>
+        <w:t>.</w:t>
+      </w:r>
+    </w:p>
+    <w:p>
+      <w:r>
+        <w:t xml:space="preserve">In a short time, </w:t>
+      </w:r>
+      <w:r>
+        <w:t xml:space="preserve">only Blind Marnie </w:t>
+      </w:r>
+      <w:r>
+        <w:t>proved capable of supporting herself with</w:t>
+      </w:r>
+      <w:r>
+        <w:t xml:space="preserve">out assistance from Mosey. </w:t>
+      </w:r>
+      <w:r>
+        <w:t xml:space="preserve">Every day, she walked the farm with faithful Ferdinand collecting herbs and roots and </w:t>
+      </w:r>
+      <w:r>
+        <w:t xml:space="preserve">other natural </w:t>
+      </w:r>
+      <w:r>
+        <w:t>things she used to craft powerful charms and potions.</w:t>
+      </w:r>
+      <w:r>
+        <w:t xml:space="preserve"> </w:t>
+      </w:r>
+      <w:r>
+        <w:t>These fetched a premium from her fellow witches and from a wider community spiritualists</w:t>
+      </w:r>
+      <w:r>
+        <w:t>,</w:t>
+      </w:r>
+      <w:r>
+        <w:t xml:space="preserve"> health nuts</w:t>
+      </w:r>
+      <w:r>
+        <w:t xml:space="preserve"> and tourists.</w:t>
+      </w:r>
+    </w:p>
+    <w:p>
+      <w:r>
+        <w:t>Blind Marnie</w:t>
+      </w:r>
+      <w:r>
+        <w:t xml:space="preserve"> </w:t>
+      </w:r>
+      <w:r>
+        <w:t>thrived and prospered after Horace’s deat</w:t>
+      </w:r>
+      <w:r>
+        <w:t>h. She became Mosey’s favorite and began to exert an air of authority among the siblings.</w:t>
+      </w:r>
+      <w:r>
+        <w:t xml:space="preserve"> Fall foliage was in full color and the woods</w:t>
+      </w:r>
+      <w:r>
+        <w:t xml:space="preserve"> were luminous that morning under golden-hued October sun.</w:t>
+      </w:r>
+    </w:p>
+    <w:p>
+      <w:r>
+        <w:t>Wesley had breakfast outside that morning, on the back deck of the farmhouse.</w:t>
+      </w:r>
+    </w:p>
+    <w:p>
+      <w:r>
+        <w:t xml:space="preserve">Blind </w:t>
+      </w:r>
+      <w:r>
+        <w:t xml:space="preserve">Marnie was </w:t>
+      </w:r>
+      <w:r>
+        <w:t>already there, seated at the metal bistro table</w:t>
+      </w:r>
+      <w:r>
+        <w:t xml:space="preserve"> on the far side.</w:t>
+      </w:r>
+      <w:r>
+        <w:t xml:space="preserve"> Wes, generally, avoided Blind Marnie and might have gone somewhere else, but </w:t>
+      </w:r>
+      <w:r>
+        <w:t>Blind Marnie was distracted</w:t>
+      </w:r>
+      <w:r>
+        <w:t xml:space="preserve">. </w:t>
+      </w:r>
+      <w:r>
+        <w:t>A mass of leather cording</w:t>
+      </w:r>
+      <w:r>
+        <w:t xml:space="preserve"> lay </w:t>
+      </w:r>
+      <w:r>
+        <w:t xml:space="preserve">in front of her and </w:t>
+      </w:r>
+      <w:r>
+        <w:t>this had her rapt attention</w:t>
+      </w:r>
+      <w:r>
+        <w:t>. She did not acknowledge Wes’s presence.</w:t>
+      </w:r>
+    </w:p>
+    <w:p>
+      <w:r>
+        <w:t xml:space="preserve">Wes took a seat at the </w:t>
+      </w:r>
+      <w:r>
+        <w:t xml:space="preserve">opposite end of the deck at a </w:t>
+      </w:r>
+      <w:r>
+        <w:t xml:space="preserve">bench built into the </w:t>
+      </w:r>
+      <w:r>
+        <w:t>deck’s railing</w:t>
+      </w:r>
+      <w:r>
+        <w:t>.</w:t>
+      </w:r>
+      <w:r>
+        <w:t xml:space="preserve"> </w:t>
+      </w:r>
+      <w:r>
+        <w:t>It was a large deck and spanned the length of the farmhouse, and</w:t>
+      </w:r>
+      <w:r>
+        <w:t xml:space="preserve"> </w:t>
+      </w:r>
+      <w:r>
+        <w:t xml:space="preserve">the risk of an unpleasant interaction with his Aunt Marnie </w:t>
+      </w:r>
+      <w:r>
+        <w:t>seemed</w:t>
+      </w:r>
+      <w:r>
+        <w:t xml:space="preserve"> remote.</w:t>
+      </w:r>
+    </w:p>
+    <w:p>
+      <w:r>
+        <w:t>To Wes’s right was the small guest house where Uncle Beau lived. U</w:t>
+      </w:r>
+      <w:r>
+        <w:t xml:space="preserve">ncle </w:t>
+      </w:r>
+      <w:r>
+        <w:t>Smash stayed in a room there when he wasn’t away on NASCAR activities.</w:t>
+      </w:r>
+      <w:r>
+        <w:t xml:space="preserve"> A concrete parking pad served as a sort of boundary between the front yard of the guesthouse and the </w:t>
+      </w:r>
+      <w:r>
+        <w:t>back yard of the farmhouse. Directly in front of Wes was an open field. A narrow dirt lane</w:t>
+      </w:r>
+      <w:r>
+        <w:t xml:space="preserve"> ran through it</w:t>
+      </w:r>
+      <w:r>
+        <w:t xml:space="preserve"> disappeared into the trees beyond.</w:t>
+      </w:r>
+    </w:p>
+    <w:p>
+      <w:r>
+        <w:t>Wes wanted to know what Aunt Marnie was doing with those leather chords. At first he thought she was crocheting</w:t>
+      </w:r>
+      <w:r>
+        <w:t xml:space="preserve"> but she had no needle. She was working at it with her nimble witch fingers.</w:t>
+      </w:r>
+    </w:p>
+    <w:p>
+      <w:r>
+        <w:t xml:space="preserve">A yellow tabby </w:t>
+      </w:r>
+      <w:r>
+        <w:t>lept onto the bench and investigated Wes’s cereal.</w:t>
+      </w:r>
+      <w:r>
+        <w:t xml:space="preserve"> </w:t>
+      </w:r>
+      <w:r>
+        <w:t>The cat showed up on the farm last year</w:t>
+      </w:r>
+      <w:r>
+        <w:t xml:space="preserve">. </w:t>
+      </w:r>
+    </w:p>
+    <w:p>
+      <w:r>
+        <w:t xml:space="preserve">“All </w:t>
+      </w:r>
+      <w:r>
+        <w:t>yellow tabby cats are male,” declared Uncle Dan</w:t>
+      </w:r>
+      <w:r>
+        <w:t>,</w:t>
+      </w:r>
+    </w:p>
+    <w:p/>
+    <w:p>
+      <w:r>
+        <w:lastRenderedPageBreak/>
+        <w:t>Wes faced an open field that was the opposite direction of the orchard. A narrow dirt lane ran though the field and disa</w:t>
+      </w:r>
+    </w:p>
+    <w:p/>
+    <w:p/>
+    <w:p>
+      <w:r>
+        <w:t xml:space="preserve">There no days more beautiful in this part of the country than October days and this was a beautiful a day as Wesley could remember. </w:t>
+      </w:r>
+    </w:p>
+    <w:p/>
+    <w:p>
+      <w:r>
+        <w:t>It was a large deck and spanned the length of the farmhouse.</w:t>
+      </w:r>
+      <w:r>
+        <w:t xml:space="preserve"> It faced </w:t>
+      </w:r>
+      <w:r>
+        <w:t>a large open field opposite the orchard</w:t>
+      </w:r>
+      <w:r>
+        <w:t>.</w:t>
+      </w:r>
+      <w:r>
+        <w:t xml:space="preserve"> Blind</w:t>
+      </w:r>
+      <w:r>
+        <w:t xml:space="preserve"> </w:t>
+      </w:r>
+      <w:r>
+        <w:t xml:space="preserve">A concrete </w:t>
+      </w:r>
+      <w:r>
+        <w:t>parking</w:t>
+      </w:r>
+      <w:r>
+        <w:t xml:space="preserve"> pad</w:t>
+      </w:r>
+      <w:r>
+        <w:t xml:space="preserve"> created </w:t>
+      </w:r>
+      <w:r>
+        <w:t>a</w:t>
+      </w:r>
+      <w:r>
+        <w:t xml:space="preserve"> </w:t>
+      </w:r>
+      <w:r>
+        <w:t xml:space="preserve">sort of </w:t>
+      </w:r>
+      <w:r>
+        <w:t xml:space="preserve">boundary between the </w:t>
+      </w:r>
+      <w:r>
+        <w:t>back yard of the farmhouse and the front yard of a small guest house on the right.</w:t>
+      </w:r>
+      <w:r>
+        <w:t xml:space="preserve"> It was here that uncle Beau lived, with * staying there when he wasn’t </w:t>
+      </w:r>
+      <w:r>
+        <w:t>away on NASCAR activities</w:t>
+      </w:r>
+      <w:r>
+        <w:t>.</w:t>
+      </w:r>
+    </w:p>
+    <w:p>
+      <w:r>
+        <w:t xml:space="preserve">Blind Marnie </w:t>
+      </w:r>
+      <w:r>
+        <w:t xml:space="preserve">sat on the side of the deck closest to the guest house. She sat at a </w:t>
+      </w:r>
+      <w:r>
+        <w:t xml:space="preserve">round metal bistro table </w:t>
+      </w:r>
+      <w:r>
+        <w:t>with</w:t>
+      </w:r>
+      <w:r>
+        <w:t xml:space="preserve"> her hands busy</w:t>
+      </w:r>
+      <w:r>
+        <w:t xml:space="preserve"> at a</w:t>
+      </w:r>
+      <w:r>
+        <w:t xml:space="preserve"> pile</w:t>
+      </w:r>
+      <w:r>
+        <w:t xml:space="preserve"> of leather chording that </w:t>
+      </w:r>
+      <w:r>
+        <w:t>lay</w:t>
+      </w:r>
+      <w:r>
+        <w:t xml:space="preserve"> tangled</w:t>
+      </w:r>
+      <w:r>
+        <w:t xml:space="preserve"> in front of her.</w:t>
+      </w:r>
+      <w:r>
+        <w:t xml:space="preserve"> </w:t>
+      </w:r>
+      <w:r>
+        <w:t>The leather cording had her rapt attention. At first, Wes thought she was crocheting</w:t>
+      </w:r>
+      <w:r>
+        <w:t>, but she had no needle</w:t>
+      </w:r>
+      <w:r>
+        <w:t>.</w:t>
+      </w:r>
+    </w:p>
+    <w:p>
+      <w:r>
+        <w:t>She appeared to be braiding the chord and tying curious knots</w:t>
+      </w:r>
+      <w:r>
+        <w:t xml:space="preserve">. He wanted to know what she was doing, but he didn’t ask. </w:t>
+      </w:r>
+      <w:r>
+        <w:t xml:space="preserve">He knew that would draw a sharp response. So he carried his bowl of cereal </w:t>
+      </w:r>
+      <w:r>
+        <w:t xml:space="preserve">straight across the deck </w:t>
+      </w:r>
+      <w:r>
+        <w:t xml:space="preserve">to </w:t>
+      </w:r>
+      <w:r>
+        <w:t>a bench built into the railing</w:t>
+      </w:r>
+      <w:r>
+        <w:t xml:space="preserve"> and sat down.</w:t>
+      </w:r>
+      <w:r>
+        <w:t xml:space="preserve"> </w:t>
+      </w:r>
+    </w:p>
+    <w:p>
+      <w:r>
+        <w:t xml:space="preserve">Just to the right was the guest house. Uncle Beau lived there and Uncle * </w:t>
+      </w:r>
+      <w:r>
+        <w:t>had a room he stayed in when he wasn’t traveling on his NASCAR activities.</w:t>
+      </w:r>
+      <w:r>
+        <w:t xml:space="preserve"> A concrete parking pad served as a sort of boundary between the back yard of the </w:t>
+      </w:r>
+      <w:r>
+        <w:t xml:space="preserve">farmhouse and the front yard of the guest house. </w:t>
+      </w:r>
+      <w:r>
+        <w:t>The front yard of the guest house had no other boundary. It melded into a</w:t>
+      </w:r>
+      <w:r>
+        <w:t xml:space="preserve">n </w:t>
+      </w:r>
+      <w:r>
+        <w:t xml:space="preserve">large </w:t>
+      </w:r>
+      <w:r>
+        <w:t>open</w:t>
+      </w:r>
+      <w:r>
+        <w:t xml:space="preserve"> field</w:t>
+      </w:r>
+      <w:r>
+        <w:t xml:space="preserve"> that was border</w:t>
+      </w:r>
+      <w:r>
+        <w:t>ed by</w:t>
+      </w:r>
+      <w:r>
+        <w:t xml:space="preserve"> trees</w:t>
+      </w:r>
+      <w:r>
+        <w:t>.</w:t>
+      </w:r>
+      <w:r>
+        <w:t xml:space="preserve"> A narrow, dirt lane ran through the field and disappeared into the woods </w:t>
+      </w:r>
+      <w:r>
+        <w:t>in the direction Wes was facing.</w:t>
+      </w:r>
+    </w:p>
+    <w:p>
+      <w:r>
+        <w:t>Wes ate his cereal and observed the laying hens</w:t>
+      </w:r>
+      <w:r>
+        <w:t>. They were foraging in the back yard this morning</w:t>
+      </w:r>
+      <w:r>
+        <w:t xml:space="preserve"> and murmuring their contentment at one another.</w:t>
+      </w:r>
+    </w:p>
+    <w:p>
+      <w:r>
+        <w:t>Pl</w:t>
+      </w:r>
+      <w:r>
+        <w:t>ump</w:t>
+      </w:r>
+      <w:r>
+        <w:t xml:space="preserve"> worm, crunch</w:t>
+      </w:r>
+      <w:r>
+        <w:t>y</w:t>
+      </w:r>
+      <w:r>
+        <w:t xml:space="preserve"> cricket.</w:t>
+      </w:r>
+      <w:r>
+        <w:br/>
+        <w:t>Can’t hidey from me.</w:t>
+      </w:r>
+      <w:r>
+        <w:br/>
+      </w:r>
+      <w:r>
+        <w:t>Pluck ‘em up. Pluck ‘em up.</w:t>
+      </w:r>
+      <w:r>
+        <w:br/>
+        <w:t>Luckety we.</w:t>
+      </w:r>
+    </w:p>
+    <w:p>
+      <w:r>
+        <w:t xml:space="preserve">Wes ate his cereal. </w:t>
+      </w:r>
+      <w:r>
+        <w:t xml:space="preserve">No days are more beautiful than October days in this part of the country, and this was a beautiful an October day as Wes could remember. </w:t>
+      </w:r>
+      <w:r>
+        <w:t xml:space="preserve">The woods glowed </w:t>
+      </w:r>
+      <w:r>
+        <w:t>vibrant with</w:t>
+      </w:r>
+      <w:r>
+        <w:t xml:space="preserve"> </w:t>
+      </w:r>
+      <w:r>
+        <w:t xml:space="preserve">reds and yellows </w:t>
+      </w:r>
+      <w:r>
+        <w:t>under</w:t>
+      </w:r>
+      <w:r>
+        <w:t xml:space="preserve"> golden hue of the October sun.</w:t>
+      </w:r>
+      <w:r>
+        <w:t xml:space="preserve"> </w:t>
+      </w:r>
+    </w:p>
+    <w:p>
+      <w:r>
+        <w:lastRenderedPageBreak/>
+        <w:t>Ferdinand, Marnie’s pig, loitered near the laying hens, and they paid him no mind.</w:t>
+      </w:r>
+      <w:r>
+        <w:t xml:space="preserve"> </w:t>
+      </w:r>
+      <w:r>
+        <w:t xml:space="preserve">Ferdinand was still a young pig and still cute. </w:t>
+      </w:r>
+      <w:r>
+        <w:t xml:space="preserve">He </w:t>
+      </w:r>
+      <w:r>
+        <w:t xml:space="preserve">nosed something off the ground near the chickens and </w:t>
+      </w:r>
+      <w:r>
+        <w:t xml:space="preserve">scamperted up the </w:t>
+      </w:r>
+      <w:r>
+        <w:t xml:space="preserve">two </w:t>
+      </w:r>
+      <w:r>
+        <w:t xml:space="preserve">steps </w:t>
+      </w:r>
+      <w:r>
+        <w:t xml:space="preserve">with </w:t>
+      </w:r>
+      <w:r>
+        <w:t xml:space="preserve">that </w:t>
+      </w:r>
+      <w:r>
+        <w:t xml:space="preserve">something in his mouth. </w:t>
+      </w:r>
+      <w:r>
+        <w:t>It was a</w:t>
+      </w:r>
+      <w:r>
+        <w:t xml:space="preserve"> feather.</w:t>
+      </w:r>
+      <w:r>
+        <w:t xml:space="preserve"> He trotted </w:t>
+      </w:r>
+      <w:r>
+        <w:t>across past Wes, across the steps and presented it to Marnie.</w:t>
+      </w:r>
+      <w:r>
+        <w:t xml:space="preserve"> She took it and examined it with her fingers.</w:t>
+      </w:r>
+    </w:p>
+    <w:p/>
+    <w:p/>
+    <w:p>
+      <w:r>
+        <w:t xml:space="preserve">Wes finished his cereal. </w:t>
+      </w:r>
+    </w:p>
+    <w:p>
+      <w:r>
+        <w:t>“Some demon talisman,” said Deacon Dan.</w:t>
+      </w:r>
+    </w:p>
+    <w:p/>
+    <w:p/>
+    <w:p/>
+    <w:p/>
+    <w:p/>
+    <w:p>
+      <w:r>
+        <w:t xml:space="preserve">At first, Wes thought she was crocheting but as he watched, he realized she was tying little knots in the </w:t>
+      </w:r>
+    </w:p>
+    <w:p>
+      <w:r>
+        <w:t>“Thank you, dear, but this is a wing feather. I need tail feathers.”</w:t>
+      </w:r>
+    </w:p>
+    <w:p>
+      <w:r>
+        <w:t xml:space="preserve">Ferdinand trotted back down the steps and </w:t>
+      </w:r>
+      <w:r>
+        <w:t>once again began nosing the earth in the vicinity of the chickens.</w:t>
+      </w:r>
+    </w:p>
+    <w:p/>
+    <w:p>
+      <w:r>
+        <w:t xml:space="preserve">Ferdinand made several trips from the porch to the yard. Each time he returned with a feather for Blind Marnie and each time that feather was rejected. Blind Marnie </w:t>
+      </w:r>
+      <w:r>
+        <w:t>became increasingly testy with the pig for interrupting her at her work</w:t>
+      </w:r>
+      <w:r>
+        <w:t xml:space="preserve"> with an inadequate offering.</w:t>
+      </w:r>
+    </w:p>
+    <w:p>
+      <w:r>
+        <w:t>“Well, find them for yourself,” said the pig.</w:t>
       </w:r>
     </w:p>
     <w:p>
@@ -65,66 +611,1703 @@
         <w:t>“</w:t>
       </w:r>
       <w:r>
-        <w:t>I’ll be completely naked,” said Blind Marnie.</w:t>
-      </w:r>
-    </w:p>
-    <w:p>
-      <w:r>
-        <w:t>“But I won’t want to go to the orchard on a full moon in October.”</w:t>
+        <w:t>Fine,” said Marnie. “I’ll go to the source</w:t>
+      </w:r>
+      <w:r>
+        <w:t>.”</w:t>
+      </w:r>
+    </w:p>
+    <w:p>
+      <w:r>
+        <w:t>Marnie rose from the table and walked past Wes at the bench</w:t>
+      </w:r>
+      <w:r>
+        <w:t xml:space="preserve"> to the steps that led to the yard. She carried a small piece of chord, about as long as </w:t>
+      </w:r>
+      <w:r>
+        <w:t>a finger. She sat on the last step with her feet on the ground and dangled the chord at the hens.</w:t>
+      </w:r>
+    </w:p>
+    <w:p>
+      <w:r>
+        <w:t>“Here, chick, chick, chick.”</w:t>
+      </w:r>
+    </w:p>
+    <w:p>
+      <w:r>
+        <w:lastRenderedPageBreak/>
+        <w:t>Several of the hens approached cautiously.</w:t>
+      </w:r>
+    </w:p>
+    <w:p>
+      <w:r>
+        <w:t>“Come see what I have for you,” Marnie said.</w:t>
+      </w:r>
+    </w:p>
+    <w:p>
+      <w:r>
+        <w:t xml:space="preserve">One of the hens came within Marnie’s reach, and, quick as a </w:t>
+      </w:r>
+      <w:r>
+        <w:t>blink</w:t>
+      </w:r>
+      <w:r>
+        <w:t>, she scooped it up. The remaining hens squaked and scattered.</w:t>
+      </w:r>
+    </w:p>
+    <w:p>
+      <w:r>
+        <w:t xml:space="preserve">“Don’t worry,” she told the captured hen. “I’ll only take a </w:t>
+      </w:r>
+      <w:r>
+        <w:t>few.”</w:t>
+      </w:r>
+    </w:p>
+    <w:p>
+      <w:r>
+        <w:t xml:space="preserve">She plucked a feather from the hen’s tail. </w:t>
+      </w:r>
+      <w:r>
+        <w:t>The hen squa</w:t>
+      </w:r>
+      <w:r>
+        <w:t>w</w:t>
+      </w:r>
+      <w:r>
+        <w:t>ked and fluttered.</w:t>
+      </w:r>
+    </w:p>
+    <w:p>
+      <w:r>
+        <w:t>“Stop it!” cried Wes. “You’re hurting it!”</w:t>
+      </w:r>
+    </w:p>
+    <w:p>
+      <w:r>
+        <w:t>“I</w:t>
       </w:r>
       <w:r>
         <w:t xml:space="preserve"> </w:t>
       </w:r>
-    </w:p>
-    <w:p>
-      <w:r>
-        <w:t>“I’ve got some strange young</w:t>
-      </w:r>
-      <w:r>
-        <w:t>ins,” said Mosey.</w:t>
-      </w:r>
-    </w:p>
-    <w:p>
-      <w:r>
-        <w:t xml:space="preserve">The Hoopers were not generally given to moonlight walks and they left Blind Marnie to </w:t>
+      <w:r>
+        <w:t>don’t need many</w:t>
+      </w:r>
+      <w:r>
+        <w:t>.”</w:t>
+      </w:r>
+    </w:p>
+    <w:p>
+      <w:r>
+        <w:t xml:space="preserve">Marnie plucked </w:t>
+      </w:r>
+      <w:r>
+        <w:t>two more</w:t>
+      </w:r>
+      <w:r>
+        <w:t xml:space="preserve"> feathers.</w:t>
+      </w:r>
+    </w:p>
+    <w:p>
+      <w:r>
+        <w:t>Buford heard Wes’s cries and came running out.</w:t>
+      </w:r>
+    </w:p>
+    <w:p>
+      <w:r>
+        <w:t>“Wes! Wes! What’s wrong, son?”</w:t>
+      </w:r>
+    </w:p>
+    <w:p>
+      <w:r>
+        <w:t xml:space="preserve">“Aunt Marnie is </w:t>
+      </w:r>
+      <w:r>
+        <w:t xml:space="preserve">torturing a </w:t>
+      </w:r>
+      <w:r>
+        <w:t>hen!”</w:t>
+      </w:r>
+    </w:p>
+    <w:p>
+      <w:r>
+        <w:t xml:space="preserve"> </w:t>
+      </w:r>
+      <w:r>
+        <w:t xml:space="preserve"> </w:t>
+      </w:r>
+      <w:r>
+        <w:t>Buford turned to Marnie.</w:t>
+      </w:r>
+    </w:p>
+    <w:p>
+      <w:r>
+        <w:t>“Marnie, let that bird go.”</w:t>
+      </w:r>
+    </w:p>
+    <w:p>
+      <w:r>
+        <w:t>“I only need 7. I’ll catch four hens and take a couple from each. They won’t even notice</w:t>
+      </w:r>
+      <w:r>
+        <w:t xml:space="preserve"> them missing</w:t>
+      </w:r>
+      <w:r>
+        <w:t>.”</w:t>
+      </w:r>
+    </w:p>
+    <w:p>
+      <w:r>
+        <w:t>“You know how sensitive that boy is. Especially when it comes to animals.”</w:t>
+      </w:r>
+    </w:p>
+    <w:p>
+      <w:r>
+        <w:t>Marnie</w:t>
+      </w:r>
+      <w:r>
+        <w:t xml:space="preserve"> was confident that she could charm more chickens into her grasp.</w:t>
+      </w:r>
+      <w:r>
+        <w:t xml:space="preserve"> </w:t>
+      </w:r>
+      <w:r>
+        <w:t xml:space="preserve">She </w:t>
+      </w:r>
+      <w:r>
+        <w:t xml:space="preserve">had </w:t>
       </w:r>
       <w:r>
         <w:t xml:space="preserve">her </w:t>
       </w:r>
       <w:r>
-        <w:t>d</w:t>
-      </w:r>
-      <w:r>
-        <w:t>work.</w:t>
-      </w:r>
-    </w:p>
-    <w:p>
-      <w:r>
-        <w:t>“That’s the dog’s favorite snipe hunding spot,” protested Wes.</w:t>
-      </w:r>
-    </w:p>
-    <w:p>
-      <w:r>
-        <w:t>“We’ll, you and the dogs won’t be snipe hunting after dark any time of year, let along the three nights of the full moon in October.”</w:t>
-      </w:r>
-    </w:p>
-    <w:p>
-      <w:r>
-        <w:t xml:space="preserve">Blind Marnie, it seemed, thrived in the years after her father’s death. Her herbs and spell components became highly sought after in covens throughout the south. Her reputation as a witch grew. She fixed up </w:t>
-      </w:r>
-      <w:r>
-        <w:t>a shack that was somewhere else on the farm and turned it into a retreat for witches and a bed and breakfast.</w:t>
-      </w:r>
-    </w:p>
-    <w:p>
-      <w:r>
-        <w:t xml:space="preserve">The other Hooper children did not fare so well. They found that the irrevocable trusts set up by their father were, indeed, revocable and the hired lawyers to do exactly that. They </w:t>
-      </w:r>
+        <w:t>two feathers and prepared to release the chicken. She listened for the flock. Silence. The</w:t>
+      </w:r>
+      <w:r>
+        <w:t xml:space="preserve"> hens had</w:t>
+      </w:r>
+      <w:r>
+        <w:t xml:space="preserve"> run away. Now Marnie would have to convince Ferdinand to </w:t>
+      </w:r>
+      <w:r>
+        <w:t xml:space="preserve">take her to </w:t>
+      </w:r>
+      <w:r>
+        <w:t xml:space="preserve">find them and Ferdinand was put out with her. He could be </w:t>
+      </w:r>
+      <w:r>
+        <w:t>surly</w:t>
+      </w:r>
+      <w:r>
+        <w:t>, that pig.</w:t>
+      </w:r>
+    </w:p>
+    <w:p>
+      <w:r>
+        <w:t>Marnie sighed.</w:t>
+      </w:r>
+    </w:p>
+    <w:p>
+      <w:r>
+        <w:t xml:space="preserve">“Sorry, dear,” she said to the hen. And </w:t>
+      </w:r>
+      <w:r>
+        <w:t>in an instant, she had seven of the birds tailfeathers in her hand.</w:t>
+      </w:r>
+    </w:p>
+    <w:p>
+      <w:r>
+        <w:t>Wes held his head and screamed.</w:t>
+      </w:r>
+    </w:p>
+    <w:p>
+      <w:r>
+        <w:t xml:space="preserve">Buford rushed to </w:t>
+      </w:r>
+      <w:r>
+        <w:t xml:space="preserve">comfort </w:t>
+      </w:r>
+      <w:r>
+        <w:t>him</w:t>
+      </w:r>
+      <w:r>
+        <w:t>, but Wes pulled away and ran into the house</w:t>
+      </w:r>
+      <w:r>
+        <w:t>.</w:t>
+      </w:r>
+    </w:p>
+    <w:p>
+      <w:r>
+        <w:t>“Son!”</w:t>
+      </w:r>
+    </w:p>
+    <w:p>
+      <w:r>
+        <w:t>Buford turned to Marnie</w:t>
+      </w:r>
+      <w:r>
+        <w:t>, his face red with rage.</w:t>
+      </w:r>
+    </w:p>
+    <w:p>
       <w:r>
         <w:lastRenderedPageBreak/>
-        <w:t>expressed their grief with spending sprees and soon spent the portion of their father’s estate apportioned to them and fell back on jjmakign a living as they always had – by asking Mosey for money.</w:t>
-      </w:r>
-    </w:p>
+        <w:t>“How could you …”</w:t>
+      </w:r>
+    </w:p>
+    <w:p>
+      <w:r>
+        <w:t>“Oh, please! Last thanksgiving you chopped off the heads of eleven turkeys right in front of him.”</w:t>
+      </w:r>
+    </w:p>
+    <w:p>
+      <w:r>
+        <w:t xml:space="preserve">“And he’s not been the same, since!” said Buford. </w:t>
+      </w:r>
+    </w:p>
+    <w:p>
+      <w:r>
+        <w:t xml:space="preserve">“The boy believes the animals </w:t>
+      </w:r>
+      <w:r>
+        <w:t>can talk to him.</w:t>
+      </w:r>
+      <w:r>
+        <w:t xml:space="preserve"> I’ve told you before, </w:t>
+      </w:r>
+      <w:r>
+        <w:t>the</w:t>
+      </w:r>
+      <w:r>
+        <w:t xml:space="preserve"> farm is no</w:t>
+      </w:r>
+      <w:r>
+        <w:t>t a good</w:t>
+      </w:r>
+      <w:r>
+        <w:t xml:space="preserve"> place for him.</w:t>
+      </w:r>
+      <w:r>
+        <w:t>”</w:t>
+      </w:r>
+    </w:p>
+    <w:p>
+      <w:r>
+        <w:t xml:space="preserve">Mosey </w:t>
+      </w:r>
+      <w:r>
+        <w:t>emerged from the farmhouse in her nightgown</w:t>
+      </w:r>
+      <w:r>
+        <w:t>.</w:t>
+      </w:r>
+    </w:p>
+    <w:p>
+      <w:r>
+        <w:t>“</w:t>
+      </w:r>
+      <w:r>
+        <w:t>Wes ran though the kitchen just crying and carrying on.</w:t>
+      </w:r>
+      <w:r>
+        <w:t>”</w:t>
+      </w:r>
+    </w:p>
+    <w:p>
+      <w:r>
+        <w:t>“I’m crafting a talisman</w:t>
+      </w:r>
+      <w:r>
+        <w:t>.”</w:t>
+      </w:r>
+    </w:p>
+    <w:p>
+      <w:r>
+        <w:t>“A talisman?”</w:t>
+      </w:r>
+    </w:p>
+    <w:p/>
+    <w:p>
+      <w:r>
+        <w:t xml:space="preserve">“October is the </w:t>
+      </w:r>
+      <w:r>
+        <w:t>m</w:t>
+      </w:r>
+      <w:r>
+        <w:t xml:space="preserve">onth of the Hunters Moon,” </w:t>
+      </w:r>
+      <w:r>
+        <w:t xml:space="preserve">she said to </w:t>
+      </w:r>
+      <w:r>
+        <w:t>Buford</w:t>
+      </w:r>
+      <w:r>
+        <w:t xml:space="preserve"> one fall morning</w:t>
+      </w:r>
+      <w:r>
+        <w:t>. “</w:t>
+      </w:r>
+      <w:r>
+        <w:t xml:space="preserve">There is </w:t>
+      </w:r>
+      <w:r>
+        <w:t xml:space="preserve">considerable </w:t>
+      </w:r>
+      <w:r>
+        <w:t xml:space="preserve">power under this moon, so this night and the next two I will spend in the orchard gathering </w:t>
+      </w:r>
+      <w:r>
+        <w:t xml:space="preserve">ingredients for </w:t>
+      </w:r>
+      <w:r>
+        <w:t xml:space="preserve">my </w:t>
+      </w:r>
+      <w:r>
+        <w:t>charms and potions</w:t>
+      </w:r>
+      <w:r>
+        <w:t>.</w:t>
+      </w:r>
+      <w:r>
+        <w:t xml:space="preserve"> You and Wesley are to stay out of the Orchard during this time.”</w:t>
+      </w:r>
+    </w:p>
+    <w:p>
+      <w:r>
+        <w:t>“I’ll go anywhere on this farm I want</w:t>
+      </w:r>
+      <w:r>
+        <w:t>!</w:t>
+      </w:r>
+      <w:r>
+        <w:t>”</w:t>
+      </w:r>
+    </w:p>
+    <w:p>
+      <w:r>
+        <w:t>“</w:t>
+      </w:r>
+      <w:r>
+        <w:t>Well, y</w:t>
+      </w:r>
+      <w:r>
+        <w:t>ou won’t want to go to the orchard</w:t>
+      </w:r>
+      <w:r>
+        <w:t xml:space="preserve"> for</w:t>
+      </w:r>
+      <w:r>
+        <w:t xml:space="preserve"> the next</w:t>
+      </w:r>
+      <w:r>
+        <w:t xml:space="preserve"> three </w:t>
+      </w:r>
+      <w:r>
+        <w:t>nights</w:t>
+      </w:r>
+      <w:r>
+        <w:t>. I’ll be completely naked.</w:t>
+      </w:r>
+      <w:r>
+        <w:t xml:space="preserve">” </w:t>
+      </w:r>
+    </w:p>
+    <w:p>
+      <w:r>
+        <w:t>“Oh, hell.”</w:t>
+      </w:r>
+    </w:p>
+    <w:p>
+      <w:r>
+        <w:t>“</w:t>
+      </w:r>
+      <w:r>
+        <w:t>K</w:t>
+      </w:r>
+      <w:r>
+        <w:t xml:space="preserve">eep an eye on </w:t>
+      </w:r>
+      <w:r>
+        <w:t>Wesley</w:t>
+      </w:r>
+      <w:r>
+        <w:t>.</w:t>
+      </w:r>
+      <w:r>
+        <w:t xml:space="preserve"> Make sure he doesn’t sneak out </w:t>
+      </w:r>
+      <w:r>
+        <w:t>of the house</w:t>
+      </w:r>
+      <w:r>
+        <w:t>.</w:t>
+      </w:r>
+      <w:r>
+        <w:t>”</w:t>
+      </w:r>
+    </w:p>
+    <w:p>
+      <w:r>
+        <w:t>“</w:t>
+      </w:r>
+      <w:r>
+        <w:t>Oh, there’s no way he’s sneaking out of the house!</w:t>
+      </w:r>
+      <w:r>
+        <w:t>” said Buford.</w:t>
+      </w:r>
+    </w:p>
+    <w:p>
+      <w:r>
+        <w:t>That night, while Buford slept, Wesley snuck out of the house</w:t>
+      </w:r>
+      <w:r>
+        <w:t xml:space="preserve">. </w:t>
+      </w:r>
+      <w:r>
+        <w:t xml:space="preserve">It couldn’t have been easier. </w:t>
+      </w:r>
+      <w:r>
+        <w:t>If Wesley had friends, he would have invited them over to see his aunt naked</w:t>
+      </w:r>
+      <w:r>
+        <w:t>, but</w:t>
+      </w:r>
+      <w:r>
+        <w:t xml:space="preserve"> Wes had only the animals.</w:t>
+      </w:r>
+    </w:p>
+    <w:p>
+      <w:r>
+        <w:t>The moon was bright</w:t>
+      </w:r>
+      <w:r>
+        <w:t>. Wes was able to see the form of his aunt</w:t>
+      </w:r>
+      <w:r>
+        <w:t xml:space="preserve"> </w:t>
+      </w:r>
+      <w:r>
+        <w:t>and</w:t>
+      </w:r>
+      <w:r>
+        <w:t xml:space="preserve"> her pig</w:t>
+      </w:r>
+      <w:r>
+        <w:t xml:space="preserve"> </w:t>
+      </w:r>
+      <w:r>
+        <w:t xml:space="preserve">working the </w:t>
+      </w:r>
+      <w:r>
+        <w:t xml:space="preserve">northwest portion of the </w:t>
+      </w:r>
+      <w:r>
+        <w:t>orchard.</w:t>
+      </w:r>
+      <w:r>
+        <w:t xml:space="preserve"> </w:t>
+      </w:r>
+      <w:r>
+        <w:t>He could tell she was fully clothed in flowing witch attair</w:t>
+      </w:r>
+      <w:r>
+        <w:t>.</w:t>
+      </w:r>
+    </w:p>
+    <w:p>
+      <w:r>
+        <w:t>To the south, the orchard came almost to the driveway, sepa</w:t>
+      </w:r>
+      <w:r>
+        <w:t>rated by a</w:t>
+      </w:r>
+      <w:r>
+        <w:t xml:space="preserve"> slight berm </w:t>
+      </w:r>
+      <w:r>
+        <w:t>and a line of maples.</w:t>
+      </w:r>
+      <w:r>
+        <w:t xml:space="preserve"> Marnie carried </w:t>
+      </w:r>
+      <w:r>
+        <w:t>a</w:t>
+      </w:r>
+      <w:r>
+        <w:t xml:space="preserve"> five-gallon buckets </w:t>
+      </w:r>
+      <w:r>
+        <w:t>and was following Ferdinand. Ferdinan</w:t>
+      </w:r>
+      <w:r>
+        <w:t>d, who sniffed intently at the ground. Now and then, he would di</w:t>
+      </w:r>
+      <w:r>
+        <w:t>g something up and Marnie would place it in a bucket.</w:t>
+      </w:r>
+      <w:r>
+        <w:t xml:space="preserve"> It seemed clear that Marnie was </w:t>
+      </w:r>
+      <w:r>
+        <w:t xml:space="preserve">working her way </w:t>
+      </w:r>
+      <w:r>
+        <w:lastRenderedPageBreak/>
+        <w:t xml:space="preserve">back in the direction of the driveway. </w:t>
+      </w:r>
+      <w:r>
+        <w:t>We</w:t>
+      </w:r>
+      <w:r>
+        <w:t xml:space="preserve">s </w:t>
+      </w:r>
+      <w:r>
+        <w:t xml:space="preserve">walked along the driveway, keeping low. By the time his aunt reached this portion of the orchard, Wes meant to be concealed </w:t>
+      </w:r>
+      <w:r>
+        <w:t>in a spot where he could properly spy on her.</w:t>
+      </w:r>
+      <w:r>
+        <w:t xml:space="preserve"> </w:t>
+      </w:r>
+    </w:p>
+    <w:p>
+      <w:r>
+        <w:t>Wes climbed into one of the maples and waited.</w:t>
+      </w:r>
+    </w:p>
+    <w:p>
+      <w:r>
+        <w:t xml:space="preserve">Bandigo can smell a coyote from </w:t>
+      </w:r>
+      <w:r>
+        <w:t xml:space="preserve">the Silas Marsh. </w:t>
+      </w:r>
+    </w:p>
+    <w:p>
+      <w:r>
+        <w:t>“It’s dying,” said Grimwalt.</w:t>
+      </w:r>
+    </w:p>
+    <w:p>
+      <w:r>
+        <w:t>“What’s wrong with it?” asked Wes.</w:t>
+      </w:r>
+    </w:p>
+    <w:p>
+      <w:r>
+        <w:t>Heaving. Pain.</w:t>
+      </w:r>
+    </w:p>
+    <w:p>
+      <w:r>
+        <w:t xml:space="preserve">“Leave it,” said Grimwalt said. The image </w:t>
+      </w:r>
+      <w:r>
+        <w:t>faded.”</w:t>
+      </w:r>
+    </w:p>
+    <w:p>
+      <w:r>
+        <w:t xml:space="preserve"> </w:t>
+      </w:r>
+      <w:r>
+        <w:t>Grimwalt stood before him</w:t>
+      </w:r>
+      <w:r>
+        <w:t xml:space="preserve"> despondant, </w:t>
+      </w:r>
+      <w:r>
+        <w:t xml:space="preserve"> haggard. </w:t>
+      </w:r>
+      <w:r>
+        <w:t>His t</w:t>
+      </w:r>
+      <w:r>
+        <w:t xml:space="preserve">ail </w:t>
+      </w:r>
+      <w:r>
+        <w:t xml:space="preserve">now made </w:t>
+      </w:r>
+      <w:r>
+        <w:t>of le</w:t>
+      </w:r>
+      <w:r>
+        <w:t>ad and his coat dry and glossless</w:t>
+      </w:r>
+      <w:r>
+        <w:t>.</w:t>
+      </w:r>
+    </w:p>
+    <w:p>
+      <w:r>
+        <w:t xml:space="preserve">Grimwalt met Wess’s </w:t>
+      </w:r>
+      <w:r>
+        <w:t>stare</w:t>
+      </w:r>
+      <w:r>
+        <w:t>.</w:t>
+      </w:r>
+    </w:p>
+    <w:p>
+      <w:r>
+        <w:t>“It doesn’t matter. We</w:t>
+      </w:r>
+      <w:r>
+        <w:t xml:space="preserve"> never go to </w:t>
+      </w:r>
+      <w:r>
+        <w:t xml:space="preserve"> the Silas Marsh.”</w:t>
+      </w:r>
+    </w:p>
+    <w:p>
+      <w:r>
+        <w:t xml:space="preserve">“Come on,” said Wes. </w:t>
+      </w:r>
+      <w:r>
+        <w:t>“</w:t>
+      </w:r>
+      <w:r>
+        <w:t>Let’s go.”</w:t>
+      </w:r>
+    </w:p>
+    <w:p>
+      <w:r>
+        <w:t>“</w:t>
+      </w:r>
+      <w:r>
+        <w:t xml:space="preserve">This isn’t right,” said </w:t>
+      </w:r>
+      <w:r>
+        <w:t>Grimwalt</w:t>
+      </w:r>
+      <w:r>
+        <w:t>.</w:t>
+      </w:r>
+    </w:p>
+    <w:p>
+      <w:r>
+        <w:t>“</w:t>
+      </w:r>
+      <w:r>
+        <w:t>You don’t like this game?</w:t>
+      </w:r>
+      <w:r>
+        <w:t>”</w:t>
+      </w:r>
+      <w:r>
+        <w:t xml:space="preserve"> Bandigo asked.</w:t>
+      </w:r>
+    </w:p>
+    <w:p>
+      <w:r>
+        <w:t xml:space="preserve">“I like the game,” said Grimwalt. “It’s something else. </w:t>
+      </w:r>
+      <w:r>
+        <w:t xml:space="preserve">Let’s see if you can figure it out. </w:t>
+      </w:r>
+      <w:r>
+        <w:t>Take a sniff.</w:t>
+      </w:r>
+      <w:r>
+        <w:t>”</w:t>
+      </w:r>
+    </w:p>
+    <w:p>
+      <w:r>
+        <w:t>Bandigo</w:t>
+      </w:r>
+      <w:r>
+        <w:t xml:space="preserve"> lifted his head and sniffed. </w:t>
+      </w:r>
+    </w:p>
+    <w:p>
+      <w:r>
+        <w:t>“</w:t>
+      </w:r>
+      <w:r>
+        <w:t>I smell the creek near the bridge.</w:t>
+      </w:r>
+      <w:r>
+        <w:t>”</w:t>
+      </w:r>
+    </w:p>
+    <w:p>
+      <w:r>
+        <w:t>Grimwalt’s nostrils flared. I smell it, too. But it’s wrong.”</w:t>
+      </w:r>
+    </w:p>
+    <w:p>
+      <w:r>
+        <w:t>“Our noses are wrong?”</w:t>
+      </w:r>
+    </w:p>
+    <w:p>
+      <w:r>
+        <w:t xml:space="preserve">A voice came from </w:t>
+      </w:r>
+      <w:r>
+        <w:t>a neigboring neighboring tree</w:t>
+      </w:r>
+      <w:r>
+        <w:t>.</w:t>
+      </w:r>
+    </w:p>
+    <w:p>
+      <w:r>
+        <w:t>“You</w:t>
+      </w:r>
+      <w:r>
+        <w:t>r</w:t>
+      </w:r>
+      <w:r>
+        <w:t xml:space="preserve"> noses are right</w:t>
+      </w:r>
+      <w:r>
+        <w:t>,</w:t>
+      </w:r>
+      <w:r>
+        <w:t>” it said. “It</w:t>
+      </w:r>
+      <w:r>
+        <w:t xml:space="preserve"> i</w:t>
+      </w:r>
+      <w:r>
+        <w:t>s the wind that</w:t>
+      </w:r>
+      <w:r>
+        <w:t xml:space="preserve"> is</w:t>
+      </w:r>
+      <w:r>
+        <w:t xml:space="preserve"> wrong.”</w:t>
+      </w:r>
+    </w:p>
+    <w:p>
+      <w:r>
+        <w:t>Wes jumped</w:t>
+      </w:r>
+      <w:r>
+        <w:t>.</w:t>
+      </w:r>
+      <w:r>
+        <w:t xml:space="preserve"> </w:t>
+      </w:r>
+      <w:r>
+        <w:t>He</w:t>
+      </w:r>
+      <w:r>
+        <w:t xml:space="preserve"> looked in the direction of the voice to find a large crow </w:t>
+      </w:r>
+      <w:r>
+        <w:t>perched in the tree</w:t>
+      </w:r>
+      <w:r>
+        <w:t>.</w:t>
+      </w:r>
+      <w:r>
+        <w:t xml:space="preserve"> </w:t>
+      </w:r>
+    </w:p>
+    <w:p/>
+    <w:p/>
+    <w:p/>
+    <w:p>
+      <w:r>
+        <w:t xml:space="preserve"> </w:t>
+      </w:r>
+      <w:r>
+        <w:t xml:space="preserve"> </w:t>
+      </w:r>
+    </w:p>
+    <w:p>
+      <w:r>
+        <w:t>Wes conversed with animals all the time</w:t>
+      </w:r>
+      <w:r>
+        <w:t xml:space="preserve">, but only with animals he knew very well. He’d never been addressed by a wild animal and didn’t think it was possible. So Wes was as surprised at hearing the crow speak </w:t>
+      </w:r>
+      <w:r>
+        <w:t xml:space="preserve">to him </w:t>
+      </w:r>
+      <w:r>
+        <w:t>as you or I would be if a crow ever spoke to us.</w:t>
+      </w:r>
+    </w:p>
+    <w:p>
+      <w:r>
+        <w:t>“Who are you?” asked Wes.</w:t>
+      </w:r>
+    </w:p>
+    <w:p>
+      <w:r>
+        <w:t>“The people of the Aninuweh call me HushishushisK</w:t>
+      </w:r>
+      <w:r>
+        <w:t>yew</w:t>
+      </w:r>
+      <w:r>
+        <w:t>tPatahayah</w:t>
+      </w:r>
+      <w:r>
+        <w:t>. Do you want to know what that means in the Aninuweh tongue?”</w:t>
+      </w:r>
+    </w:p>
+    <w:p>
+      <w:r>
+        <w:t>“Yes,” said Wes.</w:t>
+      </w:r>
+    </w:p>
+    <w:p>
+      <w:r>
+        <w:t>“Yes,” said the dogs</w:t>
+      </w:r>
+      <w:r>
+        <w:t xml:space="preserve"> below</w:t>
+      </w:r>
+      <w:r>
+        <w:t>.</w:t>
+      </w:r>
+    </w:p>
+    <w:p>
+      <w:r>
+        <w:t>Abruptly, the</w:t>
+      </w:r>
+      <w:r>
+        <w:t xml:space="preserve"> crow </w:t>
+      </w:r>
+      <w:r>
+        <w:t>le</w:t>
+      </w:r>
+      <w:r>
+        <w:t>a</w:t>
+      </w:r>
+      <w:r>
+        <w:t>pt</w:t>
+      </w:r>
+      <w:r>
+        <w:t xml:space="preserve"> from its perc</w:t>
+      </w:r>
+      <w:r>
+        <w:t xml:space="preserve">h, lifted its wings and flew </w:t>
+      </w:r>
+      <w:r>
+        <w:t xml:space="preserve">directly </w:t>
+      </w:r>
+      <w:r>
+        <w:t xml:space="preserve">into </w:t>
+      </w:r>
+      <w:r>
+        <w:t>Wes’s tree</w:t>
+      </w:r>
+      <w:r>
+        <w:t>. It landed a cautious distance from Wes and peered at him with his deep, dark eyes</w:t>
+      </w:r>
+      <w:r>
+        <w:t>, cocking its head first one way, then the other</w:t>
+      </w:r>
+      <w:r>
+        <w:t xml:space="preserve">, as if </w:t>
+      </w:r>
+      <w:r>
+        <w:t>deliberating</w:t>
+      </w:r>
+      <w:r>
+        <w:t xml:space="preserve"> important matter</w:t>
+      </w:r>
+      <w:r>
+        <w:t xml:space="preserve">. Then, </w:t>
+      </w:r>
+      <w:r>
+        <w:t>having</w:t>
+      </w:r>
+      <w:r>
+        <w:t xml:space="preserve"> arrived at a judgement</w:t>
+      </w:r>
+      <w:r>
+        <w:t xml:space="preserve">, </w:t>
+      </w:r>
+      <w:r>
+        <w:t xml:space="preserve">the bird straightened </w:t>
+      </w:r>
+      <w:r>
+        <w:t>himself</w:t>
+      </w:r>
+      <w:r>
+        <w:t>.</w:t>
+      </w:r>
+    </w:p>
+    <w:p>
+      <w:r>
+        <w:t>“It means, ‘He Who Belongs in a Tree at Night</w:t>
+      </w:r>
+      <w:r>
+        <w:t xml:space="preserve">.’ </w:t>
+      </w:r>
+      <w:r>
+        <w:t>What do your people call you?”</w:t>
+      </w:r>
+    </w:p>
+    <w:p>
+      <w:r>
+        <w:t xml:space="preserve">“I’m </w:t>
+      </w:r>
+      <w:r>
+        <w:t>Wesley.”</w:t>
+      </w:r>
+    </w:p>
+    <w:p>
+      <w:r>
+        <w:t>“I can see, Wesley, that you are not a witch.</w:t>
+      </w:r>
+      <w:r>
+        <w:t>”</w:t>
+      </w:r>
+    </w:p>
+    <w:p>
+      <w:r>
+        <w:t>“No. I’m not.”</w:t>
+      </w:r>
+    </w:p>
+    <w:p>
+      <w:r>
+        <w:t>“I heard you and these dogs talking</w:t>
+      </w:r>
+      <w:r>
+        <w:t>:</w:t>
+      </w:r>
+      <w:r>
+        <w:t xml:space="preserve"> ‘The boy is a witch’ I thought. </w:t>
+      </w:r>
+      <w:r>
+        <w:t>‘That explains the wind.’</w:t>
+      </w:r>
+    </w:p>
+    <w:p>
+      <w:r>
+        <w:t>“Explains what about the wind?”</w:t>
+      </w:r>
+    </w:p>
+    <w:p>
+      <w:r>
+        <w:t xml:space="preserve">“It’s coming from the south. The wind </w:t>
+      </w:r>
+      <w:r>
+        <w:t>likes to blow downhill</w:t>
+      </w:r>
+      <w:r>
+        <w:t xml:space="preserve"> at night. Someone </w:t>
+      </w:r>
+      <w:r>
+        <w:t>must</w:t>
+      </w:r>
+      <w:r>
+        <w:t xml:space="preserve"> </w:t>
+      </w:r>
+      <w:r>
+        <w:t xml:space="preserve">have </w:t>
+      </w:r>
+      <w:r>
+        <w:t>talked it into blowing the other way</w:t>
+      </w:r>
+      <w:r>
+        <w:t>.</w:t>
+      </w:r>
+      <w:r>
+        <w:t xml:space="preserve"> With </w:t>
+      </w:r>
+      <w:r>
+        <w:t xml:space="preserve">leather </w:t>
+      </w:r>
+      <w:r>
+        <w:t xml:space="preserve">knots and </w:t>
+      </w:r>
+      <w:r>
+        <w:t xml:space="preserve">chicken </w:t>
+      </w:r>
+      <w:r>
+        <w:t xml:space="preserve">feathers </w:t>
+      </w:r>
+      <w:r>
+        <w:t>these things are done</w:t>
+      </w:r>
+      <w:r>
+        <w:t>.</w:t>
+      </w:r>
+      <w:r>
+        <w:t>”</w:t>
+      </w:r>
+    </w:p>
+    <w:p>
+      <w:r>
+        <w:t>“My aunt says she’s a witch. And she was doing something with some cord and feathers all day.”</w:t>
+      </w:r>
+    </w:p>
+    <w:p>
+      <w:r>
+        <w:t>“There it is, then,” said the crow.</w:t>
+      </w:r>
+    </w:p>
+    <w:p>
+      <w:r>
+        <w:t>“</w:t>
+      </w:r>
+      <w:r>
+        <w:t>My dad always said she was a fake. She must be really powerful.</w:t>
+      </w:r>
+      <w:r>
+        <w:t xml:space="preserve"> Crap!</w:t>
+      </w:r>
+      <w:r>
+        <w:t xml:space="preserve"> She hates me!</w:t>
+      </w:r>
+      <w:r>
+        <w:t>”</w:t>
+      </w:r>
+    </w:p>
+    <w:p>
+      <w:r>
+        <w:t>“Maybe</w:t>
+      </w:r>
+      <w:r>
+        <w:t xml:space="preserve"> she is powerful. Maybe she is not</w:t>
+      </w:r>
+      <w:r>
+        <w:t>,” said the crow. “</w:t>
+      </w:r>
+      <w:r>
+        <w:t>Changing the direction of a light breeze like th</w:t>
+      </w:r>
+      <w:r>
+        <w:t>e one tonight isn’t so hard.</w:t>
+      </w:r>
+      <w:r>
+        <w:t xml:space="preserve"> If there were thunder</w:t>
+      </w:r>
+      <w:r>
+        <w:t xml:space="preserve">, that would be different. </w:t>
+      </w:r>
+      <w:r>
+        <w:lastRenderedPageBreak/>
+        <w:t>She’d need eagle feathers and snapping turtle sinew for that.</w:t>
+      </w:r>
+      <w:r>
+        <w:t xml:space="preserve"> And she’d be likely to get into trouble. If you ever see her move a thunderstorm, you’ll have reason to wo</w:t>
+      </w:r>
+      <w:r>
+        <w:t>r</w:t>
+      </w:r>
+      <w:r>
+        <w:t>ry.”</w:t>
+      </w:r>
+    </w:p>
+    <w:p>
+      <w:r>
+        <w:t xml:space="preserve">“Well, its time for me to get back. </w:t>
+      </w:r>
+      <w:r>
+        <w:t>I’ll tell grey squirrel it’s just some witch who doesn’t want the dogs to smell what’s in the orchard</w:t>
+      </w:r>
+      <w:r>
+        <w:t xml:space="preserve"> tonight</w:t>
+      </w:r>
+      <w:r>
+        <w:t>.”</w:t>
+      </w:r>
+    </w:p>
+    <w:p>
+      <w:r>
+        <w:t>“</w:t>
+      </w:r>
+      <w:r>
+        <w:t>The orchard? What’s in the orchard tonight?</w:t>
+      </w:r>
+      <w:r>
+        <w:t>”</w:t>
+      </w:r>
+    </w:p>
+    <w:p>
+      <w:r>
+        <w:t xml:space="preserve">The crow </w:t>
+      </w:r>
+      <w:r>
+        <w:t>was silent</w:t>
+      </w:r>
+      <w:r>
+        <w:t>.</w:t>
+      </w:r>
+    </w:p>
+    <w:p>
+      <w:r>
+        <w:t>“You know about the Orchard? What’s in it? Why did grampa plant it? What’s it for?”</w:t>
+      </w:r>
+    </w:p>
+    <w:p>
+      <w:r>
+        <w:t xml:space="preserve">The crow considered a moment. </w:t>
+      </w:r>
+      <w:r>
+        <w:t>“Do you have any tobacco?”</w:t>
+      </w:r>
+    </w:p>
+    <w:p>
+      <w:r>
+        <w:t>“No.”</w:t>
+      </w:r>
+    </w:p>
+    <w:p>
+      <w:r>
+        <w:t xml:space="preserve">“Get some tobacco. Come </w:t>
+      </w:r>
+      <w:r>
+        <w:t>see me</w:t>
+      </w:r>
+      <w:r>
+        <w:t xml:space="preserve"> when the moon wanes. We’ll talk.”</w:t>
+      </w:r>
+    </w:p>
+    <w:p>
+      <w:r>
+        <w:t>The crow flew away.</w:t>
+      </w:r>
+    </w:p>
+    <w:p/>
+    <w:p/>
+    <w:p/>
+    <w:p/>
+    <w:p>
+      <w:r>
+        <w:t xml:space="preserve"> </w:t>
+      </w:r>
+      <w:r>
+        <w:t>That would have explained the wind.”</w:t>
+      </w:r>
+      <w:r>
+        <w:t xml:space="preserve"> </w:t>
+      </w:r>
+    </w:p>
+    <w:p/>
+    <w:p/>
+    <w:p>
+      <w:r>
+        <w:t xml:space="preserve"> join Wes in his tree. It landed</w:t>
+      </w:r>
+    </w:p>
+    <w:p>
+      <w:r>
+        <w:t>Th</w:t>
+      </w:r>
+    </w:p>
+    <w:p>
+      <w:r>
+        <w:t>“The</w:t>
+      </w:r>
+      <w:r>
+        <w:t xml:space="preserve"> …</w:t>
+      </w:r>
+      <w:r>
+        <w:t xml:space="preserve"> wind i</w:t>
+      </w:r>
+      <w:r>
+        <w:t>s</w:t>
+      </w:r>
+      <w:r>
+        <w:t xml:space="preserve"> wrong?”</w:t>
+      </w:r>
+    </w:p>
+    <w:p>
+      <w:r>
+        <w:t xml:space="preserve">“The wind doesn’t like </w:t>
+      </w:r>
+      <w:r>
+        <w:t>to blow</w:t>
+      </w:r>
+      <w:r>
+        <w:t xml:space="preserve"> up hill at night.</w:t>
+      </w:r>
+      <w:r>
+        <w:t xml:space="preserve"> Someone has </w:t>
+      </w:r>
+      <w:r>
+        <w:t>persuaded it to bl</w:t>
+      </w:r>
+      <w:r>
+        <w:t>ow uphill. With knots and feathers these things are done.”</w:t>
+      </w:r>
+    </w:p>
+    <w:p>
+      <w:r>
+        <w:t>The bird spoke with the deliberate drone Wes associated with native Americans. So Wes guessed the bird was associated with the Aninuweh tribe that lives in the area. (*** introduce them earlier ***)</w:t>
+      </w:r>
+    </w:p>
+    <w:p/>
+    <w:p>
+      <w:r>
+        <w:lastRenderedPageBreak/>
+        <w:t>“My aunt is a witch</w:t>
+      </w:r>
+      <w:r>
+        <w:t>. And she was</w:t>
+      </w:r>
+      <w:r>
+        <w:t xml:space="preserve"> looking for chicken feathers this morning and was</w:t>
+      </w:r>
+      <w:r>
+        <w:t xml:space="preserve"> working on some crazy knotted chord thing</w:t>
+      </w:r>
+      <w:r>
+        <w:t xml:space="preserve"> this afternoon.”</w:t>
+      </w:r>
+    </w:p>
+    <w:p>
+      <w:r>
+        <w:t>“</w:t>
+      </w:r>
+      <w:r>
+        <w:t>I think it is you who are the witch! I heard you talking to those dogs.”</w:t>
+      </w:r>
+    </w:p>
+    <w:p>
+      <w:r>
+        <w:t>“No,” said Wes</w:t>
+      </w:r>
+      <w:r>
+        <w:t>. “I’m not a witch. I can just talk to animals. Some of them, anyway.</w:t>
+      </w:r>
+      <w:r>
+        <w:t xml:space="preserve"> I don’t know how.</w:t>
+      </w:r>
+      <w:r>
+        <w:t>”</w:t>
+      </w:r>
+    </w:p>
+    <w:p>
+      <w:r>
+        <w:t xml:space="preserve">The crow flew </w:t>
+      </w:r>
+      <w:r>
+        <w:t>in</w:t>
+      </w:r>
+      <w:r>
+        <w:t>to Wes</w:t>
+      </w:r>
+      <w:r>
+        <w:t>’s</w:t>
+      </w:r>
+      <w:r>
+        <w:t xml:space="preserve"> was in and landed a safe distance from</w:t>
+      </w:r>
+      <w:r>
+        <w:t xml:space="preserve"> him</w:t>
+      </w:r>
+      <w:r>
+        <w:t xml:space="preserve">. It </w:t>
+      </w:r>
+      <w:r>
+        <w:t>examined him closely, cocking its head this way and that.</w:t>
+      </w:r>
+    </w:p>
+    <w:p>
+      <w:r>
+        <w:t>“</w:t>
+      </w:r>
+      <w:r>
+        <w:t xml:space="preserve">No. No. I can see that you are not a witch. </w:t>
+      </w:r>
+      <w:r>
+        <w:t xml:space="preserve">You are </w:t>
+      </w:r>
+      <w:r>
+        <w:t xml:space="preserve">just </w:t>
+      </w:r>
+      <w:r>
+        <w:t>old,” he said.</w:t>
+      </w:r>
+    </w:p>
+    <w:p>
+      <w:r>
+        <w:t>“No one’s ever said that to me before</w:t>
+      </w:r>
+      <w:r>
+        <w:t>.”</w:t>
+      </w:r>
+    </w:p>
+    <w:p>
+      <w:r>
+        <w:t>“No, I suppose</w:t>
+      </w:r>
+      <w:r>
+        <w:t xml:space="preserve"> they have</w:t>
+      </w:r>
+      <w:r>
+        <w:t xml:space="preserve"> not.</w:t>
+      </w:r>
+      <w:r>
+        <w:t xml:space="preserve"> You are a boy and likely have not yet seen your first hunt.</w:t>
+      </w:r>
+      <w:r>
+        <w:t xml:space="preserve"> But your blood is old.</w:t>
+      </w:r>
+      <w:r>
+        <w:t>”</w:t>
+      </w:r>
+    </w:p>
+    <w:p>
+      <w:r>
+        <w:t>“My blood?”</w:t>
+      </w:r>
+    </w:p>
+    <w:p>
+      <w:r>
+        <w:t>“You</w:t>
+      </w:r>
+      <w:r>
+        <w:t>r</w:t>
+      </w:r>
+      <w:r>
+        <w:t xml:space="preserve"> family has lived in t</w:t>
+      </w:r>
+      <w:r>
+        <w:t xml:space="preserve">hese mountains a long time. There is magic </w:t>
+      </w:r>
+      <w:r>
+        <w:t xml:space="preserve">here. Deep beneath the mountains. </w:t>
+      </w:r>
+      <w:r>
+        <w:t>When a family lives here long enough, some of it seeps into them.”</w:t>
+      </w:r>
+    </w:p>
+    <w:p>
+      <w:r>
+        <w:t>“That’s why I can talk to animals.”</w:t>
+      </w:r>
+    </w:p>
+    <w:p>
+      <w:r>
+        <w:t xml:space="preserve">“It is a </w:t>
+      </w:r>
+      <w:r>
+        <w:t xml:space="preserve">mischievous magic. And resentful. </w:t>
+      </w:r>
+      <w:r>
+        <w:t>So watch it closely.</w:t>
+      </w:r>
+      <w:r>
+        <w:t>”</w:t>
+      </w:r>
+    </w:p>
+    <w:p/>
+    <w:p/>
+    <w:p/>
+    <w:p>
+      <w:r>
+        <w:t xml:space="preserve"> </w:t>
+      </w:r>
+    </w:p>
+    <w:p>
+      <w:r>
+        <w:t xml:space="preserve">“I’m someone who belongs in a tree </w:t>
+      </w:r>
+      <w:r>
+        <w:t>at night. Who are you?”</w:t>
+      </w:r>
+    </w:p>
+    <w:p>
+      <w:r>
+        <w:t xml:space="preserve">“I’m Wes. These are my </w:t>
+      </w:r>
+      <w:r>
+        <w:t xml:space="preserve">dog </w:t>
+      </w:r>
+      <w:r>
+        <w:t>friends, Grimwalt and Bandigo.”</w:t>
+      </w:r>
+    </w:p>
+    <w:p>
+      <w:r>
+        <w:t>Grimwalt sniffed in the direction of the crow.</w:t>
+      </w:r>
+    </w:p>
+    <w:p>
+      <w:r>
+        <w:t>“I don’t think I’ve noticed you here before.”</w:t>
+      </w:r>
+    </w:p>
+    <w:p/>
+    <w:p>
+      <w:r>
+        <w:t xml:space="preserve">“No, I normally roost in the forest. </w:t>
+      </w:r>
+      <w:r>
+        <w:t xml:space="preserve">I came </w:t>
+      </w:r>
+      <w:r>
+        <w:t>h</w:t>
+      </w:r>
+      <w:r>
+        <w:t xml:space="preserve">ere </w:t>
+      </w:r>
+      <w:r>
+        <w:t xml:space="preserve">because of the wind. The wind doesn’t like </w:t>
+      </w:r>
+      <w:r>
+        <w:t>to blow</w:t>
+      </w:r>
+      <w:r>
+        <w:t xml:space="preserve"> uphill at night. Someone must have </w:t>
+      </w:r>
+      <w:r>
+        <w:t xml:space="preserve">persuaded it with knots and </w:t>
+      </w:r>
+      <w:r>
+        <w:t>feathers</w:t>
+      </w:r>
+      <w:r>
+        <w:t>.</w:t>
+      </w:r>
+      <w:r>
+        <w:t>”</w:t>
+      </w:r>
+    </w:p>
+    <w:p>
+      <w:r>
+        <w:t>“My aunt is a witch</w:t>
+      </w:r>
+      <w:r>
+        <w:t>. I saw her with a knotted chord and some feathers today</w:t>
+      </w:r>
+      <w:r>
+        <w:t>,” said Wes.</w:t>
+      </w:r>
+    </w:p>
+    <w:p>
+      <w:r>
+        <w:lastRenderedPageBreak/>
+        <w:t>“Ah, that explains it,” said the crow.</w:t>
+      </w:r>
+      <w:r>
+        <w:t xml:space="preserve"> “I’ll </w:t>
+      </w:r>
+      <w:r>
+        <w:t>can tell</w:t>
+      </w:r>
+      <w:r>
+        <w:t xml:space="preserve"> chipmunk</w:t>
+      </w:r>
+      <w:r>
+        <w:t>s</w:t>
+      </w:r>
+      <w:r>
+        <w:t xml:space="preserve"> it’s just some witc</w:t>
+      </w:r>
+      <w:r>
+        <w:t xml:space="preserve">h </w:t>
+      </w:r>
+      <w:r>
+        <w:t>who doesn’t want these</w:t>
+      </w:r>
+      <w:r>
+        <w:t xml:space="preserve"> dogs</w:t>
+      </w:r>
+      <w:r>
+        <w:t xml:space="preserve"> to smell the orchard</w:t>
+      </w:r>
+      <w:r>
+        <w:t xml:space="preserve"> tonight</w:t>
+      </w:r>
+      <w:r>
+        <w:t xml:space="preserve">. </w:t>
+      </w:r>
+      <w:r>
+        <w:t>Then t</w:t>
+      </w:r>
+      <w:r>
+        <w:t>hey’ll leave me alone.”</w:t>
+      </w:r>
+    </w:p>
+    <w:p>
+      <w:r>
+        <w:t>“But why doesn’t Blind Marnie want the dogs to smell the orchard?”</w:t>
+      </w:r>
+    </w:p>
+    <w:p>
+      <w:r>
+        <w:t>The crow was silent</w:t>
+      </w:r>
+      <w:r>
+        <w:t xml:space="preserve"> for a bit</w:t>
+      </w:r>
+      <w:r>
+        <w:t>.</w:t>
+      </w:r>
+    </w:p>
+    <w:p>
+      <w:r>
+        <w:t>“Do you have any tobacco?” he asked.</w:t>
+      </w:r>
+    </w:p>
+    <w:p>
+      <w:r>
+        <w:t>“No,” said Wes.</w:t>
+      </w:r>
+    </w:p>
+    <w:p>
+      <w:r>
+        <w:t>“You come back with tobacco, and we’ll talk more</w:t>
+      </w:r>
+      <w:r>
+        <w:t xml:space="preserve">. Come </w:t>
+      </w:r>
+      <w:r>
+        <w:t>after</w:t>
+      </w:r>
+      <w:r>
+        <w:t xml:space="preserve"> the moon wanes</w:t>
+      </w:r>
+      <w:r>
+        <w:t>.”</w:t>
+      </w:r>
+    </w:p>
+    <w:p/>
+    <w:p/>
+    <w:p/>
+    <w:p/>
+    <w:p/>
+    <w:p>
+      <w:r>
+        <w:t xml:space="preserve"> </w:t>
+      </w:r>
+    </w:p>
+    <w:p>
+      <w:r>
+        <w:t xml:space="preserve">Here I’m going to introduce </w:t>
+      </w:r>
+      <w:r>
+        <w:t>Koga</w:t>
+      </w:r>
+      <w:r>
+        <w:t>, the crow.</w:t>
+      </w:r>
+      <w:r>
+        <w:t xml:space="preserve"> He asks them why the wind is blowing wrong.</w:t>
+      </w:r>
+    </w:p>
+    <w:p>
+      <w:r>
+        <w:t>They figure out Blind Marnie has cast a spell.</w:t>
+      </w:r>
+    </w:p>
+    <w:p>
+      <w:r>
+        <w:t>Wes asks Koga if he knows the purpose of the orchard.</w:t>
+      </w:r>
+    </w:p>
+    <w:p>
+      <w:r>
+        <w:t>“Yes. I know what your grandfather had in mind.”</w:t>
+      </w:r>
+    </w:p>
+    <w:p>
+      <w:r>
+        <w:t>“What?”</w:t>
+      </w:r>
+    </w:p>
+    <w:p>
+      <w:r>
+        <w:t>“Do you have any tobacco?”</w:t>
+      </w:r>
+    </w:p>
+    <w:p>
+      <w:r>
+        <w:t>“No,” said. “Come back when you have tobacco. Then we will talk.”</w:t>
+      </w:r>
+    </w:p>
+    <w:p/>
+    <w:p>
+      <w:r>
+        <w:t>“You stole these from your aunt!” said Buford.</w:t>
+      </w:r>
+    </w:p>
+    <w:p>
+      <w:r>
+        <w:t>“Uh, no!”</w:t>
+      </w:r>
+    </w:p>
+    <w:p>
+      <w:r>
+        <w:t xml:space="preserve">“Son, lying </w:t>
+      </w:r>
+      <w:r>
+        <w:t>.”</w:t>
+      </w:r>
+    </w:p>
+    <w:p>
+      <w:r>
+        <w:t>“How long have you been smoking?”</w:t>
+      </w:r>
+    </w:p>
+    <w:p>
+      <w:r>
+        <w:t>“I don’t smoke!”</w:t>
+      </w:r>
+    </w:p>
+    <w:p>
+      <w:r>
+        <w:lastRenderedPageBreak/>
+        <w:t>“Then why did you</w:t>
+      </w:r>
+      <w:r>
+        <w:t xml:space="preserve"> steal your Aunt Marnie’s cigarettes?”</w:t>
+      </w:r>
+    </w:p>
+    <w:p>
+      <w:r>
+        <w:t xml:space="preserve">“Well, there’s this crow. </w:t>
+      </w:r>
+      <w:r>
+        <w:t xml:space="preserve">The Aninuweh people made him up. </w:t>
+      </w:r>
+      <w:r>
+        <w:t xml:space="preserve">He said he knows why grampa planted the orchard, but he </w:t>
+      </w:r>
+      <w:r>
+        <w:t>won’t tell me unless I give him some tobacco.”</w:t>
+      </w:r>
+    </w:p>
+    <w:p>
+      <w:r>
+        <w:t xml:space="preserve">Buford sighed. </w:t>
+      </w:r>
+    </w:p>
+    <w:p>
+      <w:r>
+        <w:t xml:space="preserve">Now Buford can spank him. He probably would. </w:t>
+      </w:r>
+    </w:p>
+    <w:p/>
+    <w:p/>
+    <w:p/>
+    <w:p/>
+    <w:p>
+      <w:r>
+        <w:t>Wes was surprised to find that Grimwalt and Bandigo had no enthusiasm at all for the</w:t>
+      </w:r>
+      <w:r>
+        <w:t>. They love a snip hunt.</w:t>
+      </w:r>
+      <w:r>
+        <w:t xml:space="preserve"> </w:t>
+      </w:r>
+    </w:p>
+    <w:p/>
+    <w:p/>
+    <w:p/>
+    <w:p/>
+    <w:p/>
+    <w:p/>
     <w:p>
       <w:r>
         <w:t xml:space="preserve">They speculated </w:t>
@@ -195,10 +2378,13 @@
         <w:t xml:space="preserve">. “Then </w:t>
       </w:r>
       <w:r>
-        <w:t>we’d have pork</w:t>
-      </w:r>
-      <w:r>
-        <w:t xml:space="preserve"> chops and bacon to eat.”</w:t>
+        <w:t>we</w:t>
+      </w:r>
+      <w:r>
+        <w:t xml:space="preserve"> would live off of pork chops and bacon. That doesn’t sound so bad, does it</w:t>
+      </w:r>
+      <w:r>
+        <w:t>.”</w:t>
       </w:r>
     </w:p>
     <w:p>
@@ -225,6 +2411,7 @@
     </w:p>
     <w:p>
       <w:r>
+        <w:lastRenderedPageBreak/>
         <w:t xml:space="preserve">“Hmm,” </w:t>
       </w:r>
       <w:r>
@@ -298,7 +2485,13 @@
         <w:t>Cletus</w:t>
       </w:r>
       <w:r>
-        <w:t>, you’re the dumbest person I ever met,” said Buford. “We ain’t in Belgium so our pralines is gonna be southern pralines.”</w:t>
+        <w:t>, you’re the dumbest person I ever met,” said Buford. “We</w:t>
+      </w:r>
+      <w:r>
+        <w:t>’re not</w:t>
+      </w:r>
+      <w:r>
+        <w:t xml:space="preserve"> in Belgium so our pralines is gonna be southern pralines.”</w:t>
       </w:r>
     </w:p>
     <w:p>
@@ -326,54 +2519,54 @@
     </w:p>
     <w:p>
       <w:r>
+        <w:t>“Yeah, I think it’s an Italian company.”</w:t>
+      </w:r>
+    </w:p>
+    <w:p>
+      <w:r>
+        <w:t>“Shit, Jack, with your ignorance, I don’t know how you and me got to be in the same family. First you want us to sell Belgium pralines and now it’s Italian peanutbutter.”</w:t>
+      </w:r>
+    </w:p>
+    <w:p>
+      <w:r>
+        <w:t xml:space="preserve">“Now hold on Cletus,” said </w:t>
+      </w:r>
+      <w:r>
+        <w:t>Marnie</w:t>
+      </w:r>
+      <w:r>
+        <w:t>. “That peanutbutter might be made by an Italian company, but it’s not necessarily and Itally-associated product in the mind of the consumer. Not in the same way Belgium pralines is associated with Belgium. People wouldn’t object to buying a locally sourced hazelnut butter. They’d be glad of it, in fact.”</w:t>
+      </w:r>
+    </w:p>
+    <w:p>
+      <w:r>
+        <w:t>“That dog, Bandigo, he c</w:t>
+      </w:r>
+      <w:r>
+        <w:t>a</w:t>
+      </w:r>
+      <w:r>
+        <w:t>me from Italy!”</w:t>
+      </w:r>
+    </w:p>
+    <w:p>
+      <w:r>
+        <w:t>“Yes,” said Jack. “So he did, why?”</w:t>
+      </w:r>
+    </w:p>
+    <w:p>
+      <w:r>
+        <w:t>“Don’t you see? That’s the connection between them Hazelnuts up there that dad planted and that chocolate Italian peanut butter.”</w:t>
+      </w:r>
+    </w:p>
+    <w:p>
+      <w:r>
+        <w:t>“I suppose,” said Jack, doubtfully.</w:t>
+      </w:r>
+    </w:p>
+    <w:p>
+      <w:r>
         <w:lastRenderedPageBreak/>
-        <w:t>“Yeah, I think it’s an Italian company.”</w:t>
-      </w:r>
-    </w:p>
-    <w:p>
-      <w:r>
-        <w:t>“Shit, Jack, with your ignorance, I don’t know how you and me got to be in the same family. First you want us to sell Belgium pralines and now it’s Italian peanutbutter.”</w:t>
-      </w:r>
-    </w:p>
-    <w:p>
-      <w:r>
-        <w:t xml:space="preserve">“Now hold on Cletus,” said </w:t>
-      </w:r>
-      <w:r>
-        <w:t>Marnie</w:t>
-      </w:r>
-      <w:r>
-        <w:t>. “That peanutbutter might be made by an Italian company, but it’s not necessarily and Itally-associated product in the mind of the consumer. Not in the same way Belgium pralines is associated with Belgium. People wouldn’t object to buying a locally sourced hazelnut butter. They’d be glad of it, in fact.”</w:t>
-      </w:r>
-    </w:p>
-    <w:p>
-      <w:r>
-        <w:t>“That dog, Bandigo, he c</w:t>
-      </w:r>
-      <w:r>
-        <w:t>a</w:t>
-      </w:r>
-      <w:r>
-        <w:t>me from Italy!”</w:t>
-      </w:r>
-    </w:p>
-    <w:p>
-      <w:r>
-        <w:t>“Yes,” said Jack. “So he did, why?”</w:t>
-      </w:r>
-    </w:p>
-    <w:p>
-      <w:r>
-        <w:t>“Don’t you see? That’s the connection between them Hazelnuts up there that dad planted and that chocolate Italian peanut butter.”</w:t>
-      </w:r>
-    </w:p>
-    <w:p>
-      <w:r>
-        <w:t>“I suppose,” said Jack, doubtfully.</w:t>
-      </w:r>
-    </w:p>
-    <w:p>
-      <w:r>
         <w:t>“It can’t be a coincidence,” said Buford. “Dad was going to go into competition with an Italian company that makes choclolate Hazelnut peanutbutter and so he brought in an Italian dog to help him to do it!”</w:t>
       </w:r>
     </w:p>
@@ -410,7 +2603,6 @@
     </w:p>
     <w:p>
       <w:r>
-        <w:lastRenderedPageBreak/>
         <w:t xml:space="preserve"> Then you seize the offending animal and beat it soundly with the dead chicken. Apply this treatment with the greatest of diligence and vigor.”</w:t>
       </w:r>
     </w:p>
@@ -440,6 +2632,7 @@
     </w:p>
     <w:p>
       <w:r>
+        <w:lastRenderedPageBreak/>
         <w:t>“Runaway horses?” asked Buford.</w:t>
       </w:r>
     </w:p>
@@ -473,37 +2666,37 @@
     <w:p/>
     <w:p>
       <w:r>
+        <w:t>“It doesn’t make sense,” said Wincey. “Dad can’t have intended some mass production of a product with a four-acre hazelnut orchard.”</w:t>
+      </w:r>
+    </w:p>
+    <w:p>
+      <w:r>
+        <w:t>“What then? And why Bandigo? From Italy?”</w:t>
+      </w:r>
+    </w:p>
+    <w:p>
+      <w:r>
+        <w:t>Wincey didn’t know, but agreed that it might be possible to have a small production and disstibute through local stores and local commercials was something they could attempt and still preserve some of the family fortune.</w:t>
+      </w:r>
+    </w:p>
+    <w:p>
+      <w:r>
+        <w:t>“Whose going to do all the work?” asked Blind Marnie. “I think creating a product, bringing it to market is a lot more effort that you want to take on, Buford, even if you had the ability.”</w:t>
+      </w:r>
+    </w:p>
+    <w:p>
+      <w:r>
+        <w:t>“Ervine Carter would help us,” said Arwin. “Dad liked him. Knows production and distribution.”</w:t>
+      </w:r>
+    </w:p>
+    <w:p>
+      <w:r>
+        <w:t>“Ervine Carter!” cried Buford. “I used to play poker with him. He was always going on about how we should do something with the money Dad made and get a business going again. Of course he’ll help!”</w:t>
+      </w:r>
+    </w:p>
+    <w:p>
+      <w:r>
         <w:lastRenderedPageBreak/>
-        <w:t>“It doesn’t make sense,” said Wincey. “Dad can’t have intended some mass production of a product with a four-acre hazelnut orchard.”</w:t>
-      </w:r>
-    </w:p>
-    <w:p>
-      <w:r>
-        <w:t>“What then? And why Bandigo? From Italy?”</w:t>
-      </w:r>
-    </w:p>
-    <w:p>
-      <w:r>
-        <w:t>Wincey didn’t know, but agreed that it might be possible to have a small production and disstibute through local stores and local commercials was something they could attempt and still preserve some of the family fortune.</w:t>
-      </w:r>
-    </w:p>
-    <w:p>
-      <w:r>
-        <w:t>“Whose going to do all the work?” asked Blind Marnie. “I think creating a product, bringing it to market is a lot more effort that you want to take on, Buford, even if you had the ability.”</w:t>
-      </w:r>
-    </w:p>
-    <w:p>
-      <w:r>
-        <w:t>“Ervine Carter would help us,” said Arwin. “Dad liked him. Knows production and distribution.”</w:t>
-      </w:r>
-    </w:p>
-    <w:p>
-      <w:r>
-        <w:t>“Ervine Carter!” cried Buford. “I used to play poker with him. He was always going on about how we should do something with the money Dad made and get a business going again. Of course he’ll help!”</w:t>
-      </w:r>
-    </w:p>
-    <w:p>
-      <w:r>
         <w:t>The enterprise nearly along the traditional faultline between lBuford and Blind Marnie over the shape of the jars. Blind Marnie wanted a patterned French sqare or hex and Buford insisting that a fancy jar projected lack of confidence in the product within, and insisted on a plain round vessel. The issue consumed the family and</w:t>
       </w:r>
     </w:p>
@@ -548,7 +2741,6 @@
     </w:p>
     <w:p>
       <w:r>
-        <w:lastRenderedPageBreak/>
         <w:t>“I have to keep them distracted. No one else can know the secret of the orchard.”</w:t>
       </w:r>
     </w:p>

</xml_diff>